<commit_message>
Add Martabe WIs batch 11 (cyanide analyser calibration, intertank screen, viscometer, anemometer, flocculant sieve test)
Co-Authored-By: Claude Sonnet 5.5 <noreply@anthropic.com>
Claude-Session: https://claude.ai/code/session_0121qocWgsZdFAsne2oz9sHT
</commit_message>
<xml_diff>
--- a/SWI/203-Plant-Survey/MM-4034-033-OR-03-SWI-PRO-MET-203-010-Interstage-and-Safety-Screen-Efficiency-Check-and-Loss-Quantificat-RevA.docx
+++ b/SWI/203-Plant-Survey/MM-4034-033-OR-03-SWI-PRO-MET-203-010-Interstage-and-Safety-Screen-Efficiency-Check-and-Loss-Quantificat-RevA.docx
@@ -602,6 +602,60 @@
       <w:pPr>
         <w:spacing w:after="100" w:before="0" w:line="245"/>
       </w:pPr>
+    </w:p>
+    <w:tbl>
+      <w:tblPr>
+        <w:tblW w:type="dxa" w:w="9026"/>
+        <w:tblBorders>
+          <w:left w:val="single" w:color="B7791F" w:sz="18"/>
+        </w:tblBorders>
+        <w:tblCellMar>
+          <w:top w:type="dxa" w:w="90"/>
+          <w:left w:type="dxa" w:w="150"/>
+          <w:bottom w:type="dxa" w:w="90"/>
+          <w:right w:type="dxa" w:w="120"/>
+        </w:tblCellMar>
+      </w:tblPr>
+      <w:tblGrid>
+        <w:gridCol w:w="9026"/>
+      </w:tblGrid>
+      <w:tr>
+        <w:tc>
+          <w:tcPr>
+            <w:tcW w:type="dxa" w:w="9026"/>
+            <w:shd w:val="clear" w:color="auto" w:fill="FFF4D6"/>
+          </w:tcPr>
+          <w:p>
+            <w:pPr>
+              <w:spacing w:after="0" w:before="0" w:line="245"/>
+            </w:pPr>
+            <w:r>
+              <w:rPr>
+                <w:rFonts w:ascii="Calibri" w:cs="Calibri" w:eastAsia="Calibri" w:hAnsi="Calibri"/>
+                <w:b/>
+                <w:bCs/>
+                <w:color w:val="7A4B00"/>
+                <w:sz w:val="17"/>
+                <w:szCs w:val="17"/>
+              </w:rPr>
+              <w:t xml:space="preserve">DRAFT FOR REVIEW. Martabe work instruction 'Intertank Screen Inspection' (DOC-3-MET-PMC-WIN-00125-IE, v1.0, issued 25/12/2024) added as Section 6 Part B. Its hazard controls were not carried in the source. Not approved until reviewed. JSEA JSEA-PRO-MET-203-010 must be updated for the added hazard row.</w:t>
+            </w:r>
+          </w:p>
+        </w:tc>
+      </w:tr>
+    </w:tbl>
+    <w:p>
+      <w:pPr>
+        <w:spacing w:after="60" w:before="0" w:line="245"/>
+      </w:pPr>
+      <w:r>
+        <w:rPr>
+          <w:rFonts w:ascii="Calibri" w:cs="Calibri" w:eastAsia="Calibri" w:hAnsi="Calibri"/>
+          <w:sz w:val="17"/>
+          <w:szCs w:val="17"/>
+        </w:rPr>
+        <w:t xml:space="preserve"/>
+      </w:r>
     </w:p>
     <w:p>
       <w:pPr>
@@ -1487,6 +1541,56 @@
           </w:p>
         </w:tc>
       </w:tr>
+      <w:tr>
+        <w:tc>
+          <w:tcPr>
+            <w:tcW w:type="dxa" w:w="2900"/>
+            <w:tcMar>
+              <w:top w:type="dxa" w:w="55"/>
+              <w:left w:type="dxa" w:w="85"/>
+              <w:bottom w:type="dxa" w:w="55"/>
+              <w:right w:type="dxa" w:w="85"/>
+            </w:tcMar>
+          </w:tcPr>
+          <w:p>
+            <w:pPr>
+              <w:spacing w:after="0" w:line="235"/>
+            </w:pPr>
+            <w:r>
+              <w:rPr>
+                <w:rFonts w:ascii="Calibri" w:cs="Calibri" w:eastAsia="Calibri" w:hAnsi="Calibri"/>
+                <w:sz w:val="16"/>
+                <w:szCs w:val="16"/>
+              </w:rPr>
+              <w:t xml:space="preserve">[JSEA to confirm] A lifted screen overhead, cyanide-bearing slurry on the screen, and cuts from the feeler gauge</w:t>
+            </w:r>
+          </w:p>
+        </w:tc>
+        <w:tc>
+          <w:tcPr>
+            <w:tcW w:type="dxa" w:w="6126"/>
+            <w:tcMar>
+              <w:top w:type="dxa" w:w="55"/>
+              <w:left w:type="dxa" w:w="85"/>
+              <w:bottom w:type="dxa" w:w="55"/>
+              <w:right w:type="dxa" w:w="85"/>
+            </w:tcMar>
+          </w:tcPr>
+          <w:p>
+            <w:pPr>
+              <w:spacing w:after="0" w:line="235"/>
+            </w:pPr>
+            <w:r>
+              <w:rPr>
+                <w:rFonts w:ascii="Calibri" w:cs="Calibri" w:eastAsia="Calibri" w:hAnsi="Calibri"/>
+                <w:sz w:val="16"/>
+                <w:szCs w:val="16"/>
+              </w:rPr>
+              <w:t xml:space="preserve">Source lists these hazards but gives no controls. Lifting only by a licensed gantry crane operator, nobody under the load, screen set down on a stable cradle. Screen washed before handling; full cyanide PPE and HCN monitor as above. Cut-resistant gloves for the feeler gauge.</w:t>
+            </w:r>
+          </w:p>
+        </w:tc>
+      </w:tr>
     </w:tbl>
     <w:p>
       <w:pPr>
@@ -1984,6 +2088,24 @@
     </w:p>
     <w:p>
       <w:pPr>
+        <w:pStyle w:val="ListParagraph"/>
+        <w:numPr>
+          <w:ilvl w:val="0"/>
+          <w:numId w:val="1"/>
+        </w:numPr>
+        <w:spacing w:after="60" w:line="245"/>
+      </w:pPr>
+      <w:r>
+        <w:rPr>
+          <w:rFonts w:ascii="Calibri" w:cs="Calibri" w:eastAsia="Calibri" w:hAnsi="Calibri"/>
+          <w:sz w:val="17"/>
+          <w:szCs w:val="17"/>
+        </w:rPr>
+        <w:t xml:space="preserve">[M] Gantry crane (licensed operator), intertank slot gauge (feeler gauge), water hose</w:t>
+      </w:r>
+    </w:p>
+    <w:p>
+      <w:pPr>
         <w:pStyle w:val="Heading1"/>
         <w:spacing w:after="120" w:before="260"/>
       </w:pPr>
@@ -2001,6 +2123,23 @@
     </w:p>
     <w:p>
       <w:pPr>
+        <w:spacing w:after="90" w:before="180" w:line="245"/>
+        <w:keepNext/>
+      </w:pPr>
+      <w:r>
+        <w:rPr>
+          <w:rFonts w:ascii="Calibri" w:cs="Calibri" w:eastAsia="Calibri" w:hAnsi="Calibri"/>
+          <w:b/>
+          <w:bCs/>
+          <w:color w:val="1F3864"/>
+          <w:sz w:val="19"/>
+          <w:szCs w:val="19"/>
+        </w:rPr>
+        <w:t xml:space="preserve">Part A - Screen loss quantification</w:t>
+      </w:r>
+    </w:p>
+    <w:p>
+      <w:pPr>
         <w:ind w:left="280"/>
         <w:spacing w:after="50" w:before="0" w:line="245"/>
       </w:pPr>
@@ -2189,6 +2328,241 @@
           <w:szCs w:val="17"/>
         </w:rPr>
         <w:t xml:space="preserve">  Feed the quantified loss into the carbon and resin inventory accounting.</w:t>
+      </w:r>
+    </w:p>
+    <w:p>
+      <w:pPr>
+        <w:spacing w:after="90" w:before="180" w:line="245"/>
+        <w:keepNext/>
+      </w:pPr>
+      <w:r>
+        <w:rPr>
+          <w:rFonts w:ascii="Calibri" w:cs="Calibri" w:eastAsia="Calibri" w:hAnsi="Calibri"/>
+          <w:b/>
+          <w:bCs/>
+          <w:color w:val="1F3864"/>
+          <w:sz w:val="19"/>
+          <w:szCs w:val="19"/>
+        </w:rPr>
+        <w:t xml:space="preserve">Part B - Intertank screen inspection with a feeler gauge [M]</w:t>
+      </w:r>
+    </w:p>
+    <w:p>
+      <w:pPr>
+        <w:spacing w:after="60" w:before="0" w:line="245"/>
+      </w:pPr>
+      <w:r>
+        <w:rPr>
+          <w:rFonts w:ascii="Calibri" w:cs="Calibri" w:eastAsia="Calibri" w:hAnsi="Calibri"/>
+          <w:sz w:val="17"/>
+          <w:szCs w:val="17"/>
+        </w:rPr>
+        <w:t xml:space="preserve">[M] = taken from the Martabe team work instruction "Intertank Screen Inspection (DOC-3-MET-PMC-WIN-00125-IE)" (25/12/2024). [CONFIRM] = unspecified or inconsistent in the source; resolve before this instruction is approved for use. Part A (original steps) is unchanged.</w:t>
+      </w:r>
+    </w:p>
+    <w:p>
+      <w:pPr>
+        <w:spacing w:after="60" w:before="0" w:line="245"/>
+      </w:pPr>
+      <w:r>
+        <w:rPr>
+          <w:rFonts w:ascii="Calibri" w:cs="Calibri" w:eastAsia="Calibri" w:hAnsi="Calibri"/>
+          <w:sz w:val="17"/>
+          <w:szCs w:val="17"/>
+        </w:rPr>
+        <w:t xml:space="preserve">Purpose [M]: decide when an intertank wedge-wire screen has worn too far. [CONFIRM] confirm in-tank intertank screens exist at this plant, how they relate to the interstage screens 032-SC-008 to 032-SC-012, and that 1.4 mm is the right limit against the carbon sieve and the Screen Aperture Register.</w:t>
+      </w:r>
+    </w:p>
+    <w:p>
+      <w:pPr>
+        <w:ind w:left="280"/>
+        <w:spacing w:after="50" w:before="0" w:line="245"/>
+      </w:pPr>
+      <w:r>
+        <w:rPr>
+          <w:rFonts w:ascii="Calibri" w:cs="Calibri" w:eastAsia="Calibri" w:hAnsi="Calibri"/>
+          <w:b/>
+          <w:bCs/>
+          <w:sz w:val="17"/>
+          <w:szCs w:val="17"/>
+        </w:rPr>
+        <w:t xml:space="preserve">9.</w:t>
+      </w:r>
+      <w:r>
+        <w:rPr>
+          <w:rFonts w:ascii="Calibri" w:cs="Calibri" w:eastAsia="Calibri" w:hAnsi="Calibri"/>
+          <w:sz w:val="17"/>
+          <w:szCs w:val="17"/>
+        </w:rPr>
+        <w:t xml:space="preserve">  Take 5 and prepare the crane, slot gauge and water hose; check they work [M].</w:t>
+      </w:r>
+    </w:p>
+    <w:p>
+      <w:pPr>
+        <w:ind w:left="280"/>
+        <w:spacing w:after="50" w:before="0" w:line="245"/>
+      </w:pPr>
+      <w:r>
+        <w:rPr>
+          <w:rFonts w:ascii="Calibri" w:cs="Calibri" w:eastAsia="Calibri" w:hAnsi="Calibri"/>
+          <w:b/>
+          <w:bCs/>
+          <w:sz w:val="17"/>
+          <w:szCs w:val="17"/>
+        </w:rPr>
+        <w:t xml:space="preserve">10.</w:t>
+      </w:r>
+      <w:r>
+        <w:rPr>
+          <w:rFonts w:ascii="Calibri" w:cs="Calibri" w:eastAsia="Calibri" w:hAnsi="Calibri"/>
+          <w:sz w:val="17"/>
+          <w:szCs w:val="17"/>
+        </w:rPr>
+        <w:t xml:space="preserve">  When to inspect: if the carbon concentration in the launder is above 0.1 g/L (see SWI-PRO-MET-201-004 Part B), inspect the intertank screen. If a screen is more than 6 months old, inspect it every 2 months.</w:t>
+      </w:r>
+    </w:p>
+    <w:p>
+      <w:pPr>
+        <w:ind w:left="280"/>
+        <w:spacing w:after="50" w:before="0" w:line="245"/>
+      </w:pPr>
+      <w:r>
+        <w:rPr>
+          <w:rFonts w:ascii="Calibri" w:cs="Calibri" w:eastAsia="Calibri" w:hAnsi="Calibri"/>
+          <w:b/>
+          <w:bCs/>
+          <w:sz w:val="17"/>
+          <w:szCs w:val="17"/>
+        </w:rPr>
+        <w:t xml:space="preserve">11.</w:t>
+      </w:r>
+      <w:r>
+        <w:rPr>
+          <w:rFonts w:ascii="Calibri" w:cs="Calibri" w:eastAsia="Calibri" w:hAnsi="Calibri"/>
+          <w:sz w:val="17"/>
+          <w:szCs w:val="17"/>
+        </w:rPr>
+        <w:t xml:space="preserve">  Lift the intertank screen with the gantry crane. The crane operator must hold a gantry crane licence.</w:t>
+      </w:r>
+    </w:p>
+    <w:p>
+      <w:pPr>
+        <w:ind w:left="280"/>
+        <w:spacing w:after="50" w:before="0" w:line="245"/>
+      </w:pPr>
+      <w:r>
+        <w:rPr>
+          <w:rFonts w:ascii="Calibri" w:cs="Calibri" w:eastAsia="Calibri" w:hAnsi="Calibri"/>
+          <w:b/>
+          <w:bCs/>
+          <w:sz w:val="17"/>
+          <w:szCs w:val="17"/>
+        </w:rPr>
+        <w:t xml:space="preserve">12.</w:t>
+      </w:r>
+      <w:r>
+        <w:rPr>
+          <w:rFonts w:ascii="Calibri" w:cs="Calibri" w:eastAsia="Calibri" w:hAnsi="Calibri"/>
+          <w:sz w:val="17"/>
+          <w:szCs w:val="17"/>
+        </w:rPr>
+        <w:t xml:space="preserve">  Wash the screen with the water hose until no slurry is left, before inspecting.</w:t>
+      </w:r>
+    </w:p>
+    <w:p>
+      <w:pPr>
+        <w:ind w:left="280"/>
+        <w:spacing w:after="50" w:before="0" w:line="245"/>
+      </w:pPr>
+      <w:r>
+        <w:rPr>
+          <w:rFonts w:ascii="Calibri" w:cs="Calibri" w:eastAsia="Calibri" w:hAnsi="Calibri"/>
+          <w:b/>
+          <w:bCs/>
+          <w:sz w:val="17"/>
+          <w:szCs w:val="17"/>
+        </w:rPr>
+        <w:t xml:space="preserve">13.</w:t>
+      </w:r>
+      <w:r>
+        <w:rPr>
+          <w:rFonts w:ascii="Calibri" w:cs="Calibri" w:eastAsia="Calibri" w:hAnsi="Calibri"/>
+          <w:sz w:val="17"/>
+          <w:szCs w:val="17"/>
+        </w:rPr>
+        <w:t xml:space="preserve">  Measure the slot gap with the feeler gauge at points from the top, through the middle, to the bottom of the screen: slide the feeler gauge into the slot, starting with the thinnest blade, until the blade fits neither loose nor tight.</w:t>
+      </w:r>
+    </w:p>
+    <w:p>
+      <w:pPr>
+        <w:ind w:left="280"/>
+        <w:spacing w:after="50" w:before="0" w:line="245"/>
+      </w:pPr>
+      <w:r>
+        <w:rPr>
+          <w:rFonts w:ascii="Calibri" w:cs="Calibri" w:eastAsia="Calibri" w:hAnsi="Calibri"/>
+          <w:b/>
+          <w:bCs/>
+          <w:sz w:val="17"/>
+          <w:szCs w:val="17"/>
+        </w:rPr>
+        <w:t xml:space="preserve">14.</w:t>
+      </w:r>
+      <w:r>
+        <w:rPr>
+          <w:rFonts w:ascii="Calibri" w:cs="Calibri" w:eastAsia="Calibri" w:hAnsi="Calibri"/>
+          <w:sz w:val="17"/>
+          <w:szCs w:val="17"/>
+        </w:rPr>
+        <w:t xml:space="preserve">  Replace the screen if the gap is above 1.4 mm. If the screen is still good, lower it back into the tank.</w:t>
+      </w:r>
+    </w:p>
+    <w:p>
+      <w:pPr>
+        <w:ind w:left="280"/>
+        <w:spacing w:after="50" w:before="0" w:line="245"/>
+      </w:pPr>
+      <w:r>
+        <w:rPr>
+          <w:rFonts w:ascii="Calibri" w:cs="Calibri" w:eastAsia="Calibri" w:hAnsi="Calibri"/>
+          <w:b/>
+          <w:bCs/>
+          <w:sz w:val="17"/>
+          <w:szCs w:val="17"/>
+        </w:rPr>
+        <w:t xml:space="preserve">15.</w:t>
+      </w:r>
+      <w:r>
+        <w:rPr>
+          <w:rFonts w:ascii="Calibri" w:cs="Calibri" w:eastAsia="Calibri" w:hAnsi="Calibri"/>
+          <w:sz w:val="17"/>
+          <w:szCs w:val="17"/>
+        </w:rPr>
+        <w:t xml:space="preserve">  Complete the 'measuring data' sheet for the screen now in the tank. Update the removed and installed dates on the 'intertank screen' sheet; if the screen is in the cradle, leave 'running in tank, days' blank. If a wedge-wire screen is replaced, change the day-count range on the 'summary' sheet to start after the new screen's date.</w:t>
+      </w:r>
+    </w:p>
+    <w:p>
+      <w:pPr>
+        <w:ind w:left="280"/>
+        <w:spacing w:after="50" w:before="0" w:line="245"/>
+      </w:pPr>
+      <w:r>
+        <w:rPr>
+          <w:rFonts w:ascii="Calibri" w:cs="Calibri" w:eastAsia="Calibri" w:hAnsi="Calibri"/>
+          <w:b/>
+          <w:bCs/>
+          <w:sz w:val="17"/>
+          <w:szCs w:val="17"/>
+        </w:rPr>
+        <w:t xml:space="preserve">16.</w:t>
+      </w:r>
+      <w:r>
+        <w:rPr>
+          <w:rFonts w:ascii="Calibri" w:cs="Calibri" w:eastAsia="Calibri" w:hAnsi="Calibri"/>
+          <w:sz w:val="17"/>
+          <w:szCs w:val="17"/>
+        </w:rPr>
+        <w:t xml:space="preserve">  Complete the 'summary' sheet and update the processing supervisors. Records: 'G:\Processing\5. Metallurgy\Metallurgy\06. CIL\07. Screen\Intertank screens\Intertank Screen Running Hours' or form DOC-4-MET-PMC-DFR-00155-EN.</w:t>
       </w:r>
     </w:p>
     <w:p>
@@ -2474,6 +2848,24 @@
           <w:szCs w:val="17"/>
         </w:rPr>
         <w:t xml:space="preserve">SWI-PRO-OPR-032-003, -004 and -005 screen instructions, issued</w:t>
+      </w:r>
+    </w:p>
+    <w:p>
+      <w:pPr>
+        <w:pStyle w:val="ListParagraph"/>
+        <w:numPr>
+          <w:ilvl w:val="0"/>
+          <w:numId w:val="1"/>
+        </w:numPr>
+        <w:spacing w:after="60" w:line="245"/>
+      </w:pPr>
+      <w:r>
+        <w:rPr>
+          <w:rFonts w:ascii="Calibri" w:cs="Calibri" w:eastAsia="Calibri" w:hAnsi="Calibri"/>
+          <w:sz w:val="17"/>
+          <w:szCs w:val="17"/>
+        </w:rPr>
+        <w:t xml:space="preserve">Martabe work instruction 'Intertank Screen Inspection' DOC-3-MET-PMC-WIN-00125-IE v1.0 (issued 25/12/2024) - Part B source</w:t>
       </w:r>
     </w:p>
     <w:sectPr>

</xml_diff>